<commit_message>
Kalan ASCII şemaları çizime çevir; 15 yeni diyagram
Slaytlarda duran 43 ASCII şema üretilmiş SVG görsellerle değiştirildi;
görsel artık kendi açıklamasının yanında duruyor, bu yüzden otomatik
eklenmiş "tek başına görsel" slaytları kaldırıldı.

- tur2_d (8) ve tur3_a (7) yeni diyagram üreteci; uret.py hepsini kapsıyor
- Yeni şemalar: kirli veri takibi, derleme zinciri, en zayıf halka,
  şifrelemenin temeli, ileri gizlilik zinciri, gizleme karar akışı,
  CFG önce/sonra
- Ders notlarına iki eksik konu eklendi: "En zayıf halka kuralı" (H10) ve
  "Hangi koda ne kadar gizleme" (H14) — daha önce yalnız slaytlardaydı
- Girintili ASCII ağaçlar markdown listeye çevrildi (H1 slayt, H9 not)
- Çift kalan görsel referansları ve bağlantı metnini bozabilecek
  köşeli parantezli alt metin düzeltildi

Doğrulama: 303 görsel referansı, eksik dosya 0, çift referans 0,
bozuk kod bloğu 0, boş slayt 0; diyagram taraması taşma/çakışma vermiyor.
</commit_message>
<xml_diff>
--- a/docs/week-15/cen429-week-15-ders-notu.en.docx
+++ b/docs/week-15/cen429-week-15-ders-notu.en.docx
@@ -2,7 +2,7 @@
 <file path=word/document.xml><?xml version="1.0" encoding="utf-8"?>
 <w:document xmlns:w="http://schemas.openxmlformats.org/wordprocessingml/2006/main" xmlns:m="http://schemas.openxmlformats.org/officeDocument/2006/math" xmlns:r="http://schemas.openxmlformats.org/officeDocument/2006/relationships" xmlns:o="urn:schemas-microsoft-com:office:office" xmlns:v="urn:schemas-microsoft-com:vml" xmlns:w10="urn:schemas-microsoft-com:office:word" xmlns:a="http://schemas.openxmlformats.org/drawingml/2006/main" xmlns:pic="http://schemas.openxmlformats.org/drawingml/2006/picture" xmlns:wp="http://schemas.openxmlformats.org/drawingml/2006/wordprocessingDrawing">
   <w:body>
-    <w:bookmarkStart w:id="28" w:name="hafta-15-final-proje-gösterimleri"/>
+    <w:bookmarkStart w:id="40" w:name="hafta-15-final-proje-gösterimleri"/>
     <w:p>
       <w:pPr>
         <w:pStyle w:val="Heading1"/>
@@ -230,7 +230,7 @@
         </w:pict>
       </w:r>
     </w:p>
-    <w:bookmarkStart w:id="21" w:name="final-kontrolü-neyi-ölçer"/>
+    <w:bookmarkStart w:id="24" w:name="final-kontrolü-neyi-ölçer"/>
     <w:p>
       <w:pPr>
         <w:pStyle w:val="Heading2"/>
@@ -245,6 +245,53 @@
       </w:pPr>
       <w:r>
         <w:t xml:space="preserve">İzlencedeki final kontrolü rubriğinin kriterleri ve güvenlik kılavuzunuzda karşılık gelen bölümler:</w:t>
+      </w:r>
+    </w:p>
+    <w:p>
+      <w:pPr>
+        <w:pStyle w:val="BodyText"/>
+      </w:pPr>
+      <w:r>
+        <w:drawing>
+          <wp:inline>
+            <wp:extent cx="5759999" cy="2687780"/>
+            <wp:effectExtent b="0" l="0" r="0" t="0"/>
+            <wp:docPr descr="RAP2 teslim içeriği" title="" id="21" name="Picture"/>
+            <a:graphic>
+              <a:graphicData uri="http://schemas.openxmlformats.org/drawingml/2006/picture">
+                <pic:pic>
+                  <pic:nvPicPr>
+                    <pic:cNvPr descr="h15-01-rap2.png" id="22" name="Picture"/>
+                    <pic:cNvPicPr>
+                      <a:picLocks noChangeArrowheads="1" noChangeAspect="1"/>
+                    </pic:cNvPicPr>
+                  </pic:nvPicPr>
+                  <pic:blipFill>
+                    <a:blip r:embed="rId20"/>
+                    <a:stretch>
+                      <a:fillRect/>
+                    </a:stretch>
+                  </pic:blipFill>
+                  <pic:spPr bwMode="auto">
+                    <a:xfrm>
+                      <a:off x="0" y="0"/>
+                      <a:ext cx="5759999" cy="2687780"/>
+                    </a:xfrm>
+                    <a:prstGeom prst="rect">
+                      <a:avLst/>
+                    </a:prstGeom>
+                    <a:noFill/>
+                    <a:ln w="9525">
+                      <a:noFill/>
+                      <a:headEnd/>
+                      <a:tailEnd/>
+                    </a:ln>
+                  </pic:spPr>
+                </pic:pic>
+              </a:graphicData>
+            </a:graphic>
+          </wp:inline>
+        </w:drawing>
       </w:r>
     </w:p>
     <w:tbl>
@@ -660,7 +707,7 @@
         </w:tc>
       </w:tr>
     </w:tbl>
-    <w:bookmarkStart w:id="20" w:name="X9ed6f7fe7e5867d4e50f468d00907ca0028a92e"/>
+    <w:bookmarkStart w:id="23" w:name="X9ed6f7fe7e5867d4e50f468d00907ca0028a92e"/>
     <w:p>
       <w:pPr>
         <w:pStyle w:val="Heading3"/>
@@ -1338,9 +1385,9 @@
         </w:pict>
       </w:r>
     </w:p>
-    <w:bookmarkEnd w:id="20"/>
-    <w:bookmarkEnd w:id="21"/>
-    <w:bookmarkStart w:id="22" w:name="hazırlık-kontrol-listesi-914.-haftalar"/>
+    <w:bookmarkEnd w:id="23"/>
+    <w:bookmarkEnd w:id="24"/>
+    <w:bookmarkStart w:id="28" w:name="hazırlık-kontrol-listesi-914.-haftalar"/>
     <w:p>
       <w:pPr>
         <w:pStyle w:val="Heading2"/>
@@ -1399,6 +1446,53 @@
     </w:p>
     <w:p>
       <w:pPr>
+        <w:pStyle w:val="FirstParagraph"/>
+      </w:pPr>
+      <w:r>
+        <w:drawing>
+          <wp:inline>
+            <wp:extent cx="5759999" cy="3638557"/>
+            <wp:effectExtent b="0" l="0" r="0" t="0"/>
+            <wp:docPr descr="Güvenlik kılavuzu haritası" title="" id="26" name="Picture"/>
+            <a:graphic>
+              <a:graphicData uri="http://schemas.openxmlformats.org/drawingml/2006/picture">
+                <pic:pic>
+                  <pic:nvPicPr>
+                    <pic:cNvPr descr="h15-02-kilavuz-haritasi.png" id="27" name="Picture"/>
+                    <pic:cNvPicPr>
+                      <a:picLocks noChangeArrowheads="1" noChangeAspect="1"/>
+                    </pic:cNvPicPr>
+                  </pic:nvPicPr>
+                  <pic:blipFill>
+                    <a:blip r:embed="rId25"/>
+                    <a:stretch>
+                      <a:fillRect/>
+                    </a:stretch>
+                  </pic:blipFill>
+                  <pic:spPr bwMode="auto">
+                    <a:xfrm>
+                      <a:off x="0" y="0"/>
+                      <a:ext cx="5759999" cy="3638557"/>
+                    </a:xfrm>
+                    <a:prstGeom prst="rect">
+                      <a:avLst/>
+                    </a:prstGeom>
+                    <a:noFill/>
+                    <a:ln w="9525">
+                      <a:noFill/>
+                      <a:headEnd/>
+                      <a:tailEnd/>
+                    </a:ln>
+                  </pic:spPr>
+                </pic:pic>
+              </a:graphicData>
+            </a:graphic>
+          </wp:inline>
+        </w:drawing>
+      </w:r>
+    </w:p>
+    <w:p>
+      <w:pPr>
         <w:pStyle w:val="BlockText"/>
       </w:pPr>
       <w:r>
@@ -1579,8 +1673,8 @@
         </w:pict>
       </w:r>
     </w:p>
-    <w:bookmarkEnd w:id="22"/>
-    <w:bookmarkStart w:id="25" w:name="gösterim-önerilen-akış"/>
+    <w:bookmarkEnd w:id="28"/>
+    <w:bookmarkStart w:id="34" w:name="gösterim-önerilen-akış"/>
     <w:p>
       <w:pPr>
         <w:pStyle w:val="Heading2"/>
@@ -1724,7 +1818,54 @@
         <w:t xml:space="preserve">Neyi bilerek kapsam dışı bıraktınız, neyi karşılayamadınız ve neden?</w:t>
       </w:r>
     </w:p>
-    <w:bookmarkStart w:id="23" w:name="gösterimde-sorulabilecek-örnek-sorular"/>
+    <w:p>
+      <w:pPr>
+        <w:pStyle w:val="FirstParagraph"/>
+      </w:pPr>
+      <w:r>
+        <w:drawing>
+          <wp:inline>
+            <wp:extent cx="5759999" cy="2283460"/>
+            <wp:effectExtent b="0" l="0" r="0" t="0"/>
+            <wp:docPr descr="Final gösterimi" title="" id="30" name="Picture"/>
+            <a:graphic>
+              <a:graphicData uri="http://schemas.openxmlformats.org/drawingml/2006/picture">
+                <pic:pic>
+                  <pic:nvPicPr>
+                    <pic:cNvPr descr="h15-03-gosterim.png" id="31" name="Picture"/>
+                    <pic:cNvPicPr>
+                      <a:picLocks noChangeArrowheads="1" noChangeAspect="1"/>
+                    </pic:cNvPicPr>
+                  </pic:nvPicPr>
+                  <pic:blipFill>
+                    <a:blip r:embed="rId29"/>
+                    <a:stretch>
+                      <a:fillRect/>
+                    </a:stretch>
+                  </pic:blipFill>
+                  <pic:spPr bwMode="auto">
+                    <a:xfrm>
+                      <a:off x="0" y="0"/>
+                      <a:ext cx="5759999" cy="2283460"/>
+                    </a:xfrm>
+                    <a:prstGeom prst="rect">
+                      <a:avLst/>
+                    </a:prstGeom>
+                    <a:noFill/>
+                    <a:ln w="9525">
+                      <a:noFill/>
+                      <a:headEnd/>
+                      <a:tailEnd/>
+                    </a:ln>
+                  </pic:spPr>
+                </pic:pic>
+              </a:graphicData>
+            </a:graphic>
+          </wp:inline>
+        </w:drawing>
+      </w:r>
+    </w:p>
+    <w:bookmarkStart w:id="32" w:name="gösterimde-sorulabilecek-örnek-sorular"/>
     <w:p>
       <w:pPr>
         <w:pStyle w:val="Heading3"/>
@@ -1817,8 +1958,8 @@
         <w:t xml:space="preserve">Hangi gereksinimi devrettiniz ve karşı taraf bunu nasıl karşılayacak?</w:t>
       </w:r>
     </w:p>
-    <w:bookmarkEnd w:id="23"/>
-    <w:bookmarkStart w:id="24" w:name="sık-yapılan-hatalar"/>
+    <w:bookmarkEnd w:id="32"/>
+    <w:bookmarkStart w:id="33" w:name="sık-yapılan-hatalar"/>
     <w:p>
       <w:pPr>
         <w:pStyle w:val="Heading3"/>
@@ -2039,9 +2180,9 @@
         </w:pict>
       </w:r>
     </w:p>
-    <w:bookmarkEnd w:id="24"/>
-    <w:bookmarkEnd w:id="25"/>
-    <w:bookmarkStart w:id="26" w:name="akademik-dürüstlük"/>
+    <w:bookmarkEnd w:id="33"/>
+    <w:bookmarkEnd w:id="34"/>
+    <w:bookmarkStart w:id="38" w:name="akademik-dürüstlük"/>
     <w:p>
       <w:pPr>
         <w:pStyle w:val="Heading2"/>
@@ -2074,6 +2215,53 @@
       </w:r>
       <w:r>
         <w:t xml:space="preserve">gösterimde takımın her üyesine soru sorulabilir. Başkasının kodunu ya da metnini kullandıysanız kaynağını belirtin.</w:t>
+      </w:r>
+    </w:p>
+    <w:p>
+      <w:pPr>
+        <w:pStyle w:val="BodyText"/>
+      </w:pPr>
+      <w:r>
+        <w:drawing>
+          <wp:inline>
+            <wp:extent cx="5759999" cy="2470728"/>
+            <wp:effectExtent b="0" l="0" r="0" t="0"/>
+            <wp:docPr descr="S16: plan değil sonuç" title="" id="36" name="Picture"/>
+            <a:graphic>
+              <a:graphicData uri="http://schemas.openxmlformats.org/drawingml/2006/picture">
+                <pic:pic>
+                  <pic:nvPicPr>
+                    <pic:cNvPr descr="h15-04-s16.png" id="37" name="Picture"/>
+                    <pic:cNvPicPr>
+                      <a:picLocks noChangeArrowheads="1" noChangeAspect="1"/>
+                    </pic:cNvPicPr>
+                  </pic:nvPicPr>
+                  <pic:blipFill>
+                    <a:blip r:embed="rId35"/>
+                    <a:stretch>
+                      <a:fillRect/>
+                    </a:stretch>
+                  </pic:blipFill>
+                  <pic:spPr bwMode="auto">
+                    <a:xfrm>
+                      <a:off x="0" y="0"/>
+                      <a:ext cx="5759999" cy="2470728"/>
+                    </a:xfrm>
+                    <a:prstGeom prst="rect">
+                      <a:avLst/>
+                    </a:prstGeom>
+                    <a:noFill/>
+                    <a:ln w="9525">
+                      <a:noFill/>
+                      <a:headEnd/>
+                      <a:tailEnd/>
+                    </a:ln>
+                  </pic:spPr>
+                </pic:pic>
+              </a:graphicData>
+            </a:graphic>
+          </wp:inline>
+        </w:drawing>
       </w:r>
     </w:p>
     <w:p>
@@ -2083,8 +2271,8 @@
         </w:pict>
       </w:r>
     </w:p>
-    <w:bookmarkEnd w:id="26"/>
-    <w:bookmarkStart w:id="27" w:name="dönem-sonunda"/>
+    <w:bookmarkEnd w:id="38"/>
+    <w:bookmarkStart w:id="39" w:name="dönem-sonunda"/>
     <w:p>
       <w:pPr>
         <w:pStyle w:val="Heading2"/>
@@ -2133,8 +2321,8 @@
         <w:t xml:space="preserve">Quiz-2 final döneminde yapılır; kapsam 9–14. haftalardır (16. hafta sayfası).</w:t>
       </w:r>
     </w:p>
-    <w:bookmarkEnd w:id="27"/>
-    <w:bookmarkEnd w:id="28"/>
+    <w:bookmarkEnd w:id="39"/>
+    <w:bookmarkEnd w:id="40"/>
     <w:sectPr>
       <w:headerReference r:id="rId9" w:type="default"/>
       <w:footerReference r:id="rId10" w:type="default"/>

</xml_diff>

<commit_message>
Proje rehberi: depoyu şablondan oluştur (fork yok), projeyi yerelde göster, gösterim kontrol listesi
</commit_message>
<xml_diff>
--- a/docs/week-15/cen429-week-15-ders-notu.en.docx
+++ b/docs/week-15/cen429-week-15-ders-notu.en.docx
@@ -2,7 +2,7 @@
 <file path=word/document.xml><?xml version="1.0" encoding="utf-8"?>
 <w:document xmlns:w="http://schemas.openxmlformats.org/wordprocessingml/2006/main" xmlns:m="http://schemas.openxmlformats.org/officeDocument/2006/math" xmlns:r="http://schemas.openxmlformats.org/officeDocument/2006/relationships" xmlns:o="urn:schemas-microsoft-com:office:office" xmlns:v="urn:schemas-microsoft-com:vml" xmlns:w10="urn:schemas-microsoft-com:office:word" xmlns:a="http://schemas.openxmlformats.org/drawingml/2006/main" xmlns:pic="http://schemas.openxmlformats.org/drawingml/2006/picture" xmlns:wp="http://schemas.openxmlformats.org/drawingml/2006/wordprocessingDrawing">
   <w:body>
-    <w:bookmarkStart w:id="52" w:name="week-15-final-project-demonstrations"/>
+    <w:bookmarkStart w:id="54" w:name="week-15-final-project-demonstrations"/>
     <w:p>
       <w:pPr>
         <w:pStyle w:val="Heading1"/>
@@ -1956,7 +1956,7 @@
       </w:r>
     </w:p>
     <w:bookmarkEnd w:id="39"/>
-    <w:bookmarkStart w:id="45" w:name="demonstration-suggested-flow"/>
+    <w:bookmarkStart w:id="47" w:name="demonstration-suggested-flow"/>
     <w:p>
       <w:pPr>
         <w:pStyle w:val="Heading2"/>
@@ -2156,13 +2156,35 @@
         </w:drawing>
       </w:r>
     </w:p>
-    <w:bookmarkStart w:id="43" w:name="X46943baf8a3f49bee48595db689bf5d7997106b"/>
+    <w:bookmarkStart w:id="44" w:name="demo-checklist-local"/>
     <w:p>
       <w:pPr>
         <w:pStyle w:val="Heading3"/>
       </w:pPr>
       <w:r>
-        <w:t xml:space="preserve">Sample questions you may be asked during the demonstration</w:t>
+        <w:t xml:space="preserve">Demo checklist (local)</w:t>
+      </w:r>
+    </w:p>
+    <w:p>
+      <w:pPr>
+        <w:pStyle w:val="FirstParagraph"/>
+      </w:pPr>
+      <w:r>
+        <w:t xml:space="preserve">A private repository has no GitHub Pages site, so you show the project locally (details:</w:t>
+      </w:r>
+      <w:r>
+        <w:t xml:space="preserve"> </w:t>
+      </w:r>
+      <w:hyperlink r:id="rId43">
+        <w:r>
+          <w:rPr>
+            <w:rStyle w:val="Hyperlink"/>
+          </w:rPr>
+          <w:t xml:space="preserve">Project Guide</w:t>
+        </w:r>
+      </w:hyperlink>
+      <w:r>
+        <w:t xml:space="preserve">). What you open and show, in this order:</w:t>
       </w:r>
     </w:p>
     <w:p>
@@ -2174,7 +2196,44 @@
         </w:numPr>
       </w:pPr>
       <w:r>
-        <w:t xml:space="preserve">Which key is this key derived from, where does it live, when is it deleted?</w:t>
+        <w:t xml:space="preserve">The</w:t>
+      </w:r>
+      <w:r>
+        <w:t xml:space="preserve"> </w:t>
+      </w:r>
+      <w:r>
+        <w:rPr>
+          <w:b/>
+          <w:bCs/>
+        </w:rPr>
+        <w:t xml:space="preserve">home page</w:t>
+      </w:r>
+      <w:r>
+        <w:t xml:space="preserve"> </w:t>
+      </w:r>
+      <w:r>
+        <w:t xml:space="preserve">of the local site (</w:t>
+      </w:r>
+      <w:r>
+        <w:rPr>
+          <w:rStyle w:val="VerbatimChar"/>
+        </w:rPr>
+        <w:t xml:space="preserve">9-open-site-...</w:t>
+      </w:r>
+      <w:r>
+        <w:t xml:space="preserve">, on</w:t>
+      </w:r>
+      <w:r>
+        <w:t xml:space="preserve"> </w:t>
+      </w:r>
+      <w:r>
+        <w:rPr>
+          <w:rStyle w:val="VerbatimChar"/>
+        </w:rPr>
+        <w:t xml:space="preserve">http://localhost</w:t>
+      </w:r>
+      <w:r>
+        <w:t xml:space="preserve">).</w:t>
       </w:r>
     </w:p>
     <w:p>
@@ -2186,7 +2245,17 @@
         </w:numPr>
       </w:pPr>
       <w:r>
-        <w:t xml:space="preserve">How do you validate your certificate chain? Where is hostname verification performed?</w:t>
+        <w:rPr>
+          <w:b/>
+          <w:bCs/>
+        </w:rPr>
+        <w:t xml:space="preserve">Each report page:</w:t>
+      </w:r>
+      <w:r>
+        <w:t xml:space="preserve"> </w:t>
+      </w:r>
+      <w:r>
+        <w:t xml:space="preserve">tests, code coverage, documentation coverage (Windows and Linux).</w:t>
       </w:r>
     </w:p>
     <w:p>
@@ -2198,7 +2267,20 @@
         </w:numPr>
       </w:pPr>
       <w:r>
-        <w:t xml:space="preserve">What happens if your signature verification fails? Can an old but validly signed version still be installed?</w:t>
+        <w:t xml:space="preserve">The</w:t>
+      </w:r>
+      <w:r>
+        <w:t xml:space="preserve"> </w:t>
+      </w:r>
+      <w:r>
+        <w:rPr>
+          <w:b/>
+          <w:bCs/>
+        </w:rPr>
+        <w:t xml:space="preserve">API docs</w:t>
+      </w:r>
+      <w:r>
+        <w:t xml:space="preserve">.</w:t>
       </w:r>
     </w:p>
     <w:p>
@@ -2210,7 +2292,38 @@
         </w:numPr>
       </w:pPr>
       <w:r>
-        <w:t xml:space="preserve">Did you measure the cost of obfuscation? Which functions did you obfuscate, and why?</w:t>
+        <w:t xml:space="preserve">The</w:t>
+      </w:r>
+      <w:r>
+        <w:t xml:space="preserve"> </w:t>
+      </w:r>
+      <w:r>
+        <w:rPr>
+          <w:rStyle w:val="VerbatimChar"/>
+          <w:b/>
+          <w:bCs/>
+        </w:rPr>
+        <w:t xml:space="preserve">release/</w:t>
+      </w:r>
+      <w:r>
+        <w:rPr>
+          <w:b/>
+          <w:bCs/>
+        </w:rPr>
+        <w:t xml:space="preserve"> </w:t>
+      </w:r>
+      <w:r>
+        <w:rPr>
+          <w:b/>
+          <w:bCs/>
+        </w:rPr>
+        <w:t xml:space="preserve">folder</w:t>
+      </w:r>
+      <w:r>
+        <w:t xml:space="preserve"> </w:t>
+      </w:r>
+      <w:r>
+        <w:t xml:space="preserve">listing.</w:t>
       </w:r>
     </w:p>
     <w:p>
@@ -2222,16 +2335,17 @@
         </w:numPr>
       </w:pPr>
       <w:r>
-        <w:t xml:space="preserve">Where is the evidence for this row in your compliance matrix that you marked</w:t>
-      </w:r>
-      <w:r>
-        <w:t xml:space="preserve"> </w:t>
-      </w:r>
-      <w:r>
-        <w:t xml:space="preserve">“met”</w:t>
-      </w:r>
-      <w:r>
-        <w:t xml:space="preserve">?</w:t>
+        <w:rPr>
+          <w:b/>
+          <w:bCs/>
+        </w:rPr>
+        <w:t xml:space="preserve">Run the app</w:t>
+      </w:r>
+      <w:r>
+        <w:t xml:space="preserve"> </w:t>
+      </w:r>
+      <w:r>
+        <w:t xml:space="preserve">from the release archive.</w:t>
       </w:r>
     </w:p>
     <w:p>
@@ -2243,11 +2357,118 @@
         </w:numPr>
       </w:pPr>
       <w:r>
+        <w:t xml:space="preserve">The</w:t>
+      </w:r>
+      <w:r>
+        <w:t xml:space="preserve"> </w:t>
+      </w:r>
+      <w:r>
+        <w:rPr>
+          <w:b/>
+          <w:bCs/>
+        </w:rPr>
+        <w:t xml:space="preserve">GitHub Release page</w:t>
+      </w:r>
+      <w:r>
+        <w:t xml:space="preserve"> </w:t>
+      </w:r>
+      <w:r>
+        <w:t xml:space="preserve">of your private repository (the instructor is a collaborator).</w:t>
+      </w:r>
+    </w:p>
+    <w:bookmarkEnd w:id="44"/>
+    <w:bookmarkStart w:id="45" w:name="X46943baf8a3f49bee48595db689bf5d7997106b"/>
+    <w:p>
+      <w:pPr>
+        <w:pStyle w:val="Heading3"/>
+      </w:pPr>
+      <w:r>
+        <w:t xml:space="preserve">Sample questions you may be asked during the demonstration</w:t>
+      </w:r>
+    </w:p>
+    <w:p>
+      <w:pPr>
+        <w:pStyle w:val="Compact"/>
+        <w:numPr>
+          <w:ilvl w:val="0"/>
+          <w:numId w:val="1015"/>
+        </w:numPr>
+      </w:pPr>
+      <w:r>
+        <w:t xml:space="preserve">Which key is this key derived from, where does it live, when is it deleted?</w:t>
+      </w:r>
+    </w:p>
+    <w:p>
+      <w:pPr>
+        <w:pStyle w:val="Compact"/>
+        <w:numPr>
+          <w:ilvl w:val="0"/>
+          <w:numId w:val="1015"/>
+        </w:numPr>
+      </w:pPr>
+      <w:r>
+        <w:t xml:space="preserve">How do you validate your certificate chain? Where is hostname verification performed?</w:t>
+      </w:r>
+    </w:p>
+    <w:p>
+      <w:pPr>
+        <w:pStyle w:val="Compact"/>
+        <w:numPr>
+          <w:ilvl w:val="0"/>
+          <w:numId w:val="1015"/>
+        </w:numPr>
+      </w:pPr>
+      <w:r>
+        <w:t xml:space="preserve">What happens if your signature verification fails? Can an old but validly signed version still be installed?</w:t>
+      </w:r>
+    </w:p>
+    <w:p>
+      <w:pPr>
+        <w:pStyle w:val="Compact"/>
+        <w:numPr>
+          <w:ilvl w:val="0"/>
+          <w:numId w:val="1015"/>
+        </w:numPr>
+      </w:pPr>
+      <w:r>
+        <w:t xml:space="preserve">Did you measure the cost of obfuscation? Which functions did you obfuscate, and why?</w:t>
+      </w:r>
+    </w:p>
+    <w:p>
+      <w:pPr>
+        <w:pStyle w:val="Compact"/>
+        <w:numPr>
+          <w:ilvl w:val="0"/>
+          <w:numId w:val="1015"/>
+        </w:numPr>
+      </w:pPr>
+      <w:r>
+        <w:t xml:space="preserve">Where is the evidence for this row in your compliance matrix that you marked</w:t>
+      </w:r>
+      <w:r>
+        <w:t xml:space="preserve"> </w:t>
+      </w:r>
+      <w:r>
+        <w:t xml:space="preserve">“met”</w:t>
+      </w:r>
+      <w:r>
+        <w:t xml:space="preserve">?</w:t>
+      </w:r>
+    </w:p>
+    <w:p>
+      <w:pPr>
+        <w:pStyle w:val="Compact"/>
+        <w:numPr>
+          <w:ilvl w:val="0"/>
+          <w:numId w:val="1015"/>
+        </w:numPr>
+      </w:pPr>
+      <w:r>
         <w:t xml:space="preserve">Which requirement did you defer, and how will the other party meet it?</w:t>
       </w:r>
     </w:p>
-    <w:bookmarkEnd w:id="43"/>
-    <w:bookmarkStart w:id="44" w:name="common-mistakes"/>
+    <w:bookmarkEnd w:id="45"/>
+    <w:bookmarkStart w:id="46" w:name="common-mistakes"/>
     <w:p>
       <w:pPr>
         <w:pStyle w:val="Heading3"/>
@@ -2468,9 +2689,9 @@
         </w:pict>
       </w:r>
     </w:p>
-    <w:bookmarkEnd w:id="44"/>
-    <w:bookmarkEnd w:id="45"/>
-    <w:bookmarkStart w:id="49" w:name="academic-integrity"/>
+    <w:bookmarkEnd w:id="46"/>
+    <w:bookmarkEnd w:id="47"/>
+    <w:bookmarkStart w:id="51" w:name="academic-integrity"/>
     <w:p>
       <w:pPr>
         <w:pStyle w:val="Heading2"/>
@@ -2520,18 +2741,18 @@
           <wp:inline>
             <wp:extent cx="5759999" cy="2255927"/>
             <wp:effectExtent b="0" l="0" r="0" t="0"/>
-            <wp:docPr descr="S16: results, not a plan" title="" id="47" name="Picture"/>
+            <wp:docPr descr="S16: results, not a plan" title="" id="49" name="Picture"/>
             <a:graphic>
               <a:graphicData uri="http://schemas.openxmlformats.org/drawingml/2006/picture">
                 <pic:pic>
                   <pic:nvPicPr>
-                    <pic:cNvPr descr="h15-04-s16.png" id="48" name="Picture"/>
+                    <pic:cNvPr descr="h15-04-s16.png" id="50" name="Picture"/>
                     <pic:cNvPicPr>
                       <a:picLocks noChangeArrowheads="1" noChangeAspect="1"/>
                     </pic:cNvPicPr>
                   </pic:nvPicPr>
                   <pic:blipFill>
-                    <a:blip r:embed="rId46"/>
+                    <a:blip r:embed="rId48"/>
                     <a:stretch>
                       <a:fillRect/>
                     </a:stretch>
@@ -2565,8 +2786,8 @@
         </w:pict>
       </w:r>
     </w:p>
-    <w:bookmarkEnd w:id="49"/>
-    <w:bookmarkStart w:id="51" w:name="at-the-end-of-the-term"/>
+    <w:bookmarkEnd w:id="51"/>
+    <w:bookmarkStart w:id="53" w:name="at-the-end-of-the-term"/>
     <w:p>
       <w:pPr>
         <w:pStyle w:val="Heading2"/>
@@ -2580,7 +2801,7 @@
         <w:pStyle w:val="Compact"/>
         <w:numPr>
           <w:ilvl w:val="0"/>
-          <w:numId w:val="1015"/>
+          <w:numId w:val="1016"/>
         </w:numPr>
       </w:pPr>
       <w:r>
@@ -2614,7 +2835,7 @@
         <w:pStyle w:val="Compact"/>
         <w:numPr>
           <w:ilvl w:val="0"/>
-          <w:numId w:val="1015"/>
+          <w:numId w:val="1016"/>
         </w:numPr>
       </w:pPr>
       <w:r>
@@ -2623,7 +2844,7 @@
       <w:r>
         <w:t xml:space="preserve"> </w:t>
       </w:r>
-      <w:hyperlink r:id="rId50">
+      <w:hyperlink r:id="rId52">
         <w:r>
           <w:rPr>
             <w:rStyle w:val="Hyperlink"/>
@@ -2635,8 +2856,8 @@
         <w:t xml:space="preserve">).</w:t>
       </w:r>
     </w:p>
-    <w:bookmarkEnd w:id="51"/>
-    <w:bookmarkEnd w:id="52"/>
+    <w:bookmarkEnd w:id="53"/>
+    <w:bookmarkEnd w:id="54"/>
     <w:sectPr>
       <w:headerReference r:id="rId9" w:type="default"/>
       <w:footerReference r:id="rId10" w:type="default"/>
@@ -3188,9 +3409,39 @@
     </w:lvlOverride>
   </w:num>
   <w:num w:numId="1014">
+    <w:abstractNumId w:val="99411"/>
+    <w:lvlOverride w:ilvl="0">
+      <w:startOverride w:val="1"/>
+    </w:lvlOverride>
+    <w:lvlOverride w:ilvl="1">
+      <w:startOverride w:val="1"/>
+    </w:lvlOverride>
+    <w:lvlOverride w:ilvl="2">
+      <w:startOverride w:val="1"/>
+    </w:lvlOverride>
+    <w:lvlOverride w:ilvl="3">
+      <w:startOverride w:val="1"/>
+    </w:lvlOverride>
+    <w:lvlOverride w:ilvl="4">
+      <w:startOverride w:val="1"/>
+    </w:lvlOverride>
+    <w:lvlOverride w:ilvl="5">
+      <w:startOverride w:val="1"/>
+    </w:lvlOverride>
+    <w:lvlOverride w:ilvl="6">
+      <w:startOverride w:val="1"/>
+    </w:lvlOverride>
+    <w:lvlOverride w:ilvl="7">
+      <w:startOverride w:val="1"/>
+    </w:lvlOverride>
+    <w:lvlOverride w:ilvl="8">
+      <w:startOverride w:val="1"/>
+    </w:lvlOverride>
+  </w:num>
+  <w:num w:numId="1015">
     <w:abstractNumId w:val="991"/>
   </w:num>
-  <w:num w:numId="1015">
+  <w:num w:numId="1016">
     <w:abstractNumId w:val="991"/>
   </w:num>
 </w:numbering>

</xml_diff>